<commit_message>
ficha de atencion: Se cambia de casilla a opciones el apartado de Asesoramiento, Creacion de Documento y otros
</commit_message>
<xml_diff>
--- a/public/Atencion.docx
+++ b/public/Atencion.docx
@@ -361,7 +361,27 @@
                 <w:sz w:val="22"/>
                 <w:szCs w:val="22"/>
               </w:rPr>
-              <w:t xml:space="preserve"> {rut}</w:t>
+              <w:t xml:space="preserve"> {</w:t>
+            </w:r>
+            <w:proofErr w:type="spellStart"/>
+            <w:r>
+              <w:rPr>
+                <w:rFonts w:ascii="Calibri" w:hAnsi="Calibri" w:cs="Calibri"/>
+                <w:b/>
+                <w:sz w:val="22"/>
+                <w:szCs w:val="22"/>
+              </w:rPr>
+              <w:t>rut</w:t>
+            </w:r>
+            <w:proofErr w:type="spellEnd"/>
+            <w:r>
+              <w:rPr>
+                <w:rFonts w:ascii="Calibri" w:hAnsi="Calibri" w:cs="Calibri"/>
+                <w:b/>
+                <w:sz w:val="22"/>
+                <w:szCs w:val="22"/>
+              </w:rPr>
+              <w:t>}</w:t>
             </w:r>
             <w:r>
               <w:rPr>
@@ -416,14 +436,25 @@
               </w:rPr>
               <w:t>: {</w:t>
             </w:r>
-            <w:r>
-              <w:rPr>
-                <w:rFonts w:ascii="Calibri" w:hAnsi="Calibri" w:cs="Calibri"/>
-                <w:b/>
-                <w:sz w:val="22"/>
-                <w:szCs w:val="22"/>
-              </w:rPr>
-              <w:t>fechaNacimiento}</w:t>
+            <w:proofErr w:type="spellStart"/>
+            <w:r>
+              <w:rPr>
+                <w:rFonts w:ascii="Calibri" w:hAnsi="Calibri" w:cs="Calibri"/>
+                <w:b/>
+                <w:sz w:val="22"/>
+                <w:szCs w:val="22"/>
+              </w:rPr>
+              <w:t>fechaNacimiento</w:t>
+            </w:r>
+            <w:proofErr w:type="spellEnd"/>
+            <w:r>
+              <w:rPr>
+                <w:rFonts w:ascii="Calibri" w:hAnsi="Calibri" w:cs="Calibri"/>
+                <w:b/>
+                <w:sz w:val="22"/>
+                <w:szCs w:val="22"/>
+              </w:rPr>
+              <w:t>}</w:t>
             </w:r>
             <w:r>
               <w:rPr>
@@ -543,7 +574,17 @@
                 <w:sz w:val="22"/>
                 <w:szCs w:val="22"/>
               </w:rPr>
-              <w:t>{direcci</w:t>
+              <w:t>{</w:t>
+            </w:r>
+            <w:proofErr w:type="spellStart"/>
+            <w:r>
+              <w:rPr>
+                <w:rFonts w:ascii="Calibri" w:hAnsi="Calibri" w:cs="Calibri"/>
+                <w:b/>
+                <w:sz w:val="22"/>
+                <w:szCs w:val="22"/>
+              </w:rPr>
+              <w:t>direcci</w:t>
             </w:r>
             <w:r>
               <w:rPr>
@@ -561,7 +602,17 @@
                 <w:sz w:val="22"/>
                 <w:szCs w:val="22"/>
               </w:rPr>
-              <w:t>n}</w:t>
+              <w:t>n</w:t>
+            </w:r>
+            <w:proofErr w:type="spellEnd"/>
+            <w:r>
+              <w:rPr>
+                <w:rFonts w:ascii="Calibri" w:hAnsi="Calibri" w:cs="Calibri"/>
+                <w:b/>
+                <w:sz w:val="22"/>
+                <w:szCs w:val="22"/>
+              </w:rPr>
+              <w:t>}</w:t>
             </w:r>
             <w:r>
               <w:rPr>
@@ -628,7 +679,27 @@
                 <w:sz w:val="22"/>
                 <w:szCs w:val="22"/>
               </w:rPr>
-              <w:t xml:space="preserve"> {sistemaSalud}</w:t>
+              <w:t xml:space="preserve"> {</w:t>
+            </w:r>
+            <w:proofErr w:type="spellStart"/>
+            <w:r>
+              <w:rPr>
+                <w:rFonts w:ascii="Calibri" w:hAnsi="Calibri" w:cs="Calibri"/>
+                <w:b/>
+                <w:sz w:val="22"/>
+                <w:szCs w:val="22"/>
+              </w:rPr>
+              <w:t>sistemaSalud</w:t>
+            </w:r>
+            <w:proofErr w:type="spellEnd"/>
+            <w:r>
+              <w:rPr>
+                <w:rFonts w:ascii="Calibri" w:hAnsi="Calibri" w:cs="Calibri"/>
+                <w:b/>
+                <w:sz w:val="22"/>
+                <w:szCs w:val="22"/>
+              </w:rPr>
+              <w:t>}</w:t>
             </w:r>
           </w:p>
         </w:tc>
@@ -682,7 +753,27 @@
                 <w:sz w:val="22"/>
                 <w:szCs w:val="22"/>
               </w:rPr>
-              <w:t xml:space="preserve"> {sistemaPrevisional}</w:t>
+              <w:t xml:space="preserve"> {</w:t>
+            </w:r>
+            <w:proofErr w:type="spellStart"/>
+            <w:r>
+              <w:rPr>
+                <w:rFonts w:ascii="Calibri" w:hAnsi="Calibri" w:cs="Calibri"/>
+                <w:b/>
+                <w:sz w:val="22"/>
+                <w:szCs w:val="22"/>
+              </w:rPr>
+              <w:t>sistemaPrevisional</w:t>
+            </w:r>
+            <w:proofErr w:type="spellEnd"/>
+            <w:r>
+              <w:rPr>
+                <w:rFonts w:ascii="Calibri" w:hAnsi="Calibri" w:cs="Calibri"/>
+                <w:b/>
+                <w:sz w:val="22"/>
+                <w:szCs w:val="22"/>
+              </w:rPr>
+              <w:t>}</w:t>
             </w:r>
           </w:p>
         </w:tc>
@@ -758,14 +849,25 @@
                 <w:szCs w:val="22"/>
               </w:rPr>
             </w:pPr>
-            <w:r>
-              <w:rPr>
-                <w:rFonts w:ascii="Calibri" w:hAnsi="Calibri" w:cs="Calibri"/>
-                <w:b/>
-                <w:sz w:val="22"/>
-                <w:szCs w:val="22"/>
-              </w:rPr>
-              <w:t>Nº de Celular</w:t>
+            <w:proofErr w:type="spellStart"/>
+            <w:r>
+              <w:rPr>
+                <w:rFonts w:ascii="Calibri" w:hAnsi="Calibri" w:cs="Calibri"/>
+                <w:b/>
+                <w:sz w:val="22"/>
+                <w:szCs w:val="22"/>
+              </w:rPr>
+              <w:t>Nº</w:t>
+            </w:r>
+            <w:proofErr w:type="spellEnd"/>
+            <w:r>
+              <w:rPr>
+                <w:rFonts w:ascii="Calibri" w:hAnsi="Calibri" w:cs="Calibri"/>
+                <w:b/>
+                <w:sz w:val="22"/>
+                <w:szCs w:val="22"/>
+              </w:rPr>
+              <w:t xml:space="preserve"> de Celular</w:t>
             </w:r>
             <w:r>
               <w:rPr>
@@ -1036,7 +1138,27 @@
                 <w:sz w:val="22"/>
                 <w:szCs w:val="22"/>
               </w:rPr>
-              <w:t>{lineaAtencion}</w:t>
+              <w:t>{</w:t>
+            </w:r>
+            <w:proofErr w:type="spellStart"/>
+            <w:r>
+              <w:rPr>
+                <w:rFonts w:ascii="Calibri" w:hAnsi="Calibri" w:cs="Calibri"/>
+                <w:b/>
+                <w:sz w:val="22"/>
+                <w:szCs w:val="22"/>
+              </w:rPr>
+              <w:t>lineaAtencion</w:t>
+            </w:r>
+            <w:proofErr w:type="spellEnd"/>
+            <w:r>
+              <w:rPr>
+                <w:rFonts w:ascii="Calibri" w:hAnsi="Calibri" w:cs="Calibri"/>
+                <w:b/>
+                <w:sz w:val="22"/>
+                <w:szCs w:val="22"/>
+              </w:rPr>
+              <w:t>}</w:t>
             </w:r>
           </w:p>
         </w:tc>
@@ -1090,7 +1212,27 @@
                 <w:sz w:val="22"/>
                 <w:szCs w:val="22"/>
               </w:rPr>
-              <w:t xml:space="preserve"> {viaDerivacion}</w:t>
+              <w:t xml:space="preserve"> {</w:t>
+            </w:r>
+            <w:proofErr w:type="spellStart"/>
+            <w:r>
+              <w:rPr>
+                <w:rFonts w:ascii="Calibri" w:hAnsi="Calibri" w:cs="Calibri"/>
+                <w:b/>
+                <w:sz w:val="22"/>
+                <w:szCs w:val="22"/>
+              </w:rPr>
+              <w:t>viaDerivacion</w:t>
+            </w:r>
+            <w:proofErr w:type="spellEnd"/>
+            <w:r>
+              <w:rPr>
+                <w:rFonts w:ascii="Calibri" w:hAnsi="Calibri" w:cs="Calibri"/>
+                <w:b/>
+                <w:sz w:val="22"/>
+                <w:szCs w:val="22"/>
+              </w:rPr>
+              <w:t>}</w:t>
             </w:r>
           </w:p>
         </w:tc>
@@ -1149,7 +1291,17 @@
                 <w:sz w:val="22"/>
                 <w:szCs w:val="22"/>
               </w:rPr>
-              <w:t xml:space="preserve"> {materi</w:t>
+              <w:t xml:space="preserve"> {</w:t>
+            </w:r>
+            <w:proofErr w:type="spellStart"/>
+            <w:r>
+              <w:rPr>
+                <w:rFonts w:ascii="Calibri" w:hAnsi="Calibri" w:cs="Calibri"/>
+                <w:b/>
+                <w:sz w:val="22"/>
+                <w:szCs w:val="22"/>
+              </w:rPr>
+              <w:t>materi</w:t>
             </w:r>
             <w:r>
               <w:rPr>
@@ -1167,7 +1319,17 @@
                 <w:sz w:val="22"/>
                 <w:szCs w:val="22"/>
               </w:rPr>
-              <w:t>Especifica}</w:t>
+              <w:t>Especifica</w:t>
+            </w:r>
+            <w:proofErr w:type="spellEnd"/>
+            <w:r>
+              <w:rPr>
+                <w:rFonts w:ascii="Calibri" w:hAnsi="Calibri" w:cs="Calibri"/>
+                <w:b/>
+                <w:sz w:val="22"/>
+                <w:szCs w:val="22"/>
+              </w:rPr>
+              <w:t>}</w:t>
             </w:r>
           </w:p>
         </w:tc>
@@ -1225,16 +1387,16 @@
                 <w:sz w:val="22"/>
                 <w:szCs w:val="22"/>
               </w:rPr>
-              <w:t xml:space="preserve"> {</w:t>
-            </w:r>
-            <w:r>
-              <w:rPr>
-                <w:rFonts w:ascii="Calibri" w:hAnsi="Calibri" w:cs="Calibri"/>
-                <w:b/>
-                <w:sz w:val="22"/>
-                <w:szCs w:val="22"/>
-              </w:rPr>
-              <w:t>asesoramiento}</w:t>
+              <w:t xml:space="preserve"> </w:t>
+            </w:r>
+            <w:r>
+              <w:rPr>
+                <w:rFonts w:ascii="Calibri" w:hAnsi="Calibri" w:cs="Calibri"/>
+                <w:b/>
+                <w:sz w:val="22"/>
+                <w:szCs w:val="22"/>
+              </w:rPr>
+              <w:t>[{asesoramiento}]</w:t>
             </w:r>
           </w:p>
         </w:tc>
@@ -1269,43 +1431,36 @@
                 <w:sz w:val="22"/>
                 <w:szCs w:val="22"/>
               </w:rPr>
-              <w:t xml:space="preserve"> {crea</w:t>
-            </w:r>
-            <w:r>
-              <w:rPr>
-                <w:rFonts w:ascii="Calibri" w:hAnsi="Calibri" w:cs="Calibri"/>
-                <w:b/>
-                <w:sz w:val="22"/>
-                <w:szCs w:val="22"/>
-              </w:rPr>
-              <w:t>cio</w:t>
-            </w:r>
-            <w:r>
-              <w:rPr>
-                <w:rFonts w:ascii="Calibri" w:hAnsi="Calibri" w:cs="Calibri"/>
-                <w:b/>
-                <w:sz w:val="22"/>
-                <w:szCs w:val="22"/>
-              </w:rPr>
-              <w:t>n</w:t>
-            </w:r>
-            <w:r>
-              <w:rPr>
-                <w:rFonts w:ascii="Calibri" w:hAnsi="Calibri" w:cs="Calibri"/>
-                <w:b/>
-                <w:sz w:val="22"/>
-                <w:szCs w:val="22"/>
-              </w:rPr>
-              <w:t>Documento</w:t>
-            </w:r>
-            <w:r>
-              <w:rPr>
-                <w:rFonts w:ascii="Calibri" w:hAnsi="Calibri" w:cs="Calibri"/>
-                <w:b/>
-                <w:sz w:val="22"/>
-                <w:szCs w:val="22"/>
-              </w:rPr>
-              <w:t>}</w:t>
+              <w:t xml:space="preserve"> </w:t>
+            </w:r>
+            <w:r>
+              <w:rPr>
+                <w:rFonts w:ascii="Calibri" w:hAnsi="Calibri" w:cs="Calibri"/>
+                <w:b/>
+                <w:sz w:val="22"/>
+                <w:szCs w:val="22"/>
+              </w:rPr>
+              <w:t>[{</w:t>
+            </w:r>
+            <w:proofErr w:type="spellStart"/>
+            <w:r>
+              <w:rPr>
+                <w:rFonts w:ascii="Calibri" w:hAnsi="Calibri" w:cs="Calibri"/>
+                <w:b/>
+                <w:sz w:val="22"/>
+                <w:szCs w:val="22"/>
+              </w:rPr>
+              <w:t>creacionDocumento</w:t>
+            </w:r>
+            <w:proofErr w:type="spellEnd"/>
+            <w:r>
+              <w:rPr>
+                <w:rFonts w:ascii="Calibri" w:hAnsi="Calibri" w:cs="Calibri"/>
+                <w:b/>
+                <w:sz w:val="22"/>
+                <w:szCs w:val="22"/>
+              </w:rPr>
+              <w:t>}]</w:t>
             </w:r>
           </w:p>
         </w:tc>
@@ -1358,7 +1513,36 @@
                 <w:sz w:val="22"/>
                 <w:szCs w:val="22"/>
               </w:rPr>
-              <w:t xml:space="preserve"> {otroMotivo}</w:t>
+              <w:t xml:space="preserve"> </w:t>
+            </w:r>
+            <w:r>
+              <w:rPr>
+                <w:rFonts w:ascii="Calibri" w:hAnsi="Calibri" w:cs="Calibri"/>
+                <w:b/>
+                <w:sz w:val="22"/>
+                <w:szCs w:val="22"/>
+              </w:rPr>
+              <w:t>[{</w:t>
+            </w:r>
+            <w:proofErr w:type="spellStart"/>
+            <w:r>
+              <w:rPr>
+                <w:rFonts w:ascii="Calibri" w:hAnsi="Calibri" w:cs="Calibri"/>
+                <w:b/>
+                <w:sz w:val="22"/>
+                <w:szCs w:val="22"/>
+              </w:rPr>
+              <w:t>otroMotivo</w:t>
+            </w:r>
+            <w:proofErr w:type="spellEnd"/>
+            <w:r>
+              <w:rPr>
+                <w:rFonts w:ascii="Calibri" w:hAnsi="Calibri" w:cs="Calibri"/>
+                <w:b/>
+                <w:sz w:val="22"/>
+                <w:szCs w:val="22"/>
+              </w:rPr>
+              <w:t>}]</w:t>
             </w:r>
           </w:p>
         </w:tc>
@@ -1417,7 +1601,27 @@
                 <w:sz w:val="22"/>
                 <w:szCs w:val="22"/>
               </w:rPr>
-              <w:t xml:space="preserve"> {compromisoUsuario}</w:t>
+              <w:t xml:space="preserve"> {</w:t>
+            </w:r>
+            <w:proofErr w:type="spellStart"/>
+            <w:r>
+              <w:rPr>
+                <w:rFonts w:ascii="Calibri" w:hAnsi="Calibri" w:cs="Calibri"/>
+                <w:b/>
+                <w:sz w:val="22"/>
+                <w:szCs w:val="22"/>
+              </w:rPr>
+              <w:t>compromisoUsuario</w:t>
+            </w:r>
+            <w:proofErr w:type="spellEnd"/>
+            <w:r>
+              <w:rPr>
+                <w:rFonts w:ascii="Calibri" w:hAnsi="Calibri" w:cs="Calibri"/>
+                <w:b/>
+                <w:sz w:val="22"/>
+                <w:szCs w:val="22"/>
+              </w:rPr>
+              <w:t>}</w:t>
             </w:r>
           </w:p>
           <w:p>
@@ -1487,7 +1691,27 @@
                 <w:sz w:val="22"/>
                 <w:szCs w:val="22"/>
               </w:rPr>
-              <w:t xml:space="preserve"> {compromisoProfesional}</w:t>
+              <w:t xml:space="preserve"> {</w:t>
+            </w:r>
+            <w:proofErr w:type="spellStart"/>
+            <w:r>
+              <w:rPr>
+                <w:rFonts w:ascii="Calibri" w:hAnsi="Calibri" w:cs="Calibri"/>
+                <w:b/>
+                <w:sz w:val="22"/>
+                <w:szCs w:val="22"/>
+              </w:rPr>
+              <w:t>compromisoProfesional</w:t>
+            </w:r>
+            <w:proofErr w:type="spellEnd"/>
+            <w:r>
+              <w:rPr>
+                <w:rFonts w:ascii="Calibri" w:hAnsi="Calibri" w:cs="Calibri"/>
+                <w:b/>
+                <w:sz w:val="22"/>
+                <w:szCs w:val="22"/>
+              </w:rPr>
+              <w:t>}</w:t>
             </w:r>
           </w:p>
           <w:p>
@@ -1568,7 +1792,27 @@
                 <w:sz w:val="22"/>
                 <w:szCs w:val="22"/>
               </w:rPr>
-              <w:t xml:space="preserve"> {observacionProfesional}</w:t>
+              <w:t xml:space="preserve"> {</w:t>
+            </w:r>
+            <w:proofErr w:type="spellStart"/>
+            <w:r>
+              <w:rPr>
+                <w:rFonts w:ascii="Calibri" w:hAnsi="Calibri" w:cs="Calibri"/>
+                <w:b/>
+                <w:sz w:val="22"/>
+                <w:szCs w:val="22"/>
+              </w:rPr>
+              <w:t>observacionProfesional</w:t>
+            </w:r>
+            <w:proofErr w:type="spellEnd"/>
+            <w:r>
+              <w:rPr>
+                <w:rFonts w:ascii="Calibri" w:hAnsi="Calibri" w:cs="Calibri"/>
+                <w:b/>
+                <w:sz w:val="22"/>
+                <w:szCs w:val="22"/>
+              </w:rPr>
+              <w:t>}</w:t>
             </w:r>
           </w:p>
           <w:p>
@@ -1771,7 +2015,27 @@
                 <w:sz w:val="22"/>
                 <w:szCs w:val="22"/>
               </w:rPr>
-              <w:t>{llamadoCantidad}</w:t>
+              <w:t>{</w:t>
+            </w:r>
+            <w:proofErr w:type="spellStart"/>
+            <w:r>
+              <w:rPr>
+                <w:rFonts w:ascii="Calibri" w:hAnsi="Calibri" w:cs="Calibri"/>
+                <w:b/>
+                <w:sz w:val="22"/>
+                <w:szCs w:val="22"/>
+              </w:rPr>
+              <w:t>llamadoCantidad</w:t>
+            </w:r>
+            <w:proofErr w:type="spellEnd"/>
+            <w:r>
+              <w:rPr>
+                <w:rFonts w:ascii="Calibri" w:hAnsi="Calibri" w:cs="Calibri"/>
+                <w:b/>
+                <w:sz w:val="22"/>
+                <w:szCs w:val="22"/>
+              </w:rPr>
+              <w:t>}</w:t>
             </w:r>
             <w:r>
               <w:rPr>
@@ -1817,7 +2081,27 @@
                 <w:sz w:val="22"/>
                 <w:szCs w:val="22"/>
               </w:rPr>
-              <w:t>{llamadoCantidad}</w:t>
+              <w:t>{</w:t>
+            </w:r>
+            <w:proofErr w:type="spellStart"/>
+            <w:r>
+              <w:rPr>
+                <w:rFonts w:ascii="Calibri" w:hAnsi="Calibri" w:cs="Calibri"/>
+                <w:b/>
+                <w:sz w:val="22"/>
+                <w:szCs w:val="22"/>
+              </w:rPr>
+              <w:t>llamadoCantidad</w:t>
+            </w:r>
+            <w:proofErr w:type="spellEnd"/>
+            <w:r>
+              <w:rPr>
+                <w:rFonts w:ascii="Calibri" w:hAnsi="Calibri" w:cs="Calibri"/>
+                <w:b/>
+                <w:sz w:val="22"/>
+                <w:szCs w:val="22"/>
+              </w:rPr>
+              <w:t>}</w:t>
             </w:r>
           </w:p>
         </w:tc>
@@ -1869,7 +2153,27 @@
                 <w:sz w:val="22"/>
                 <w:szCs w:val="22"/>
               </w:rPr>
-              <w:t>{llamadoFecha}</w:t>
+              <w:t>{</w:t>
+            </w:r>
+            <w:proofErr w:type="spellStart"/>
+            <w:r>
+              <w:rPr>
+                <w:rFonts w:ascii="Calibri" w:hAnsi="Calibri" w:cs="Calibri"/>
+                <w:b/>
+                <w:sz w:val="22"/>
+                <w:szCs w:val="22"/>
+              </w:rPr>
+              <w:t>llamadoFecha</w:t>
+            </w:r>
+            <w:proofErr w:type="spellEnd"/>
+            <w:r>
+              <w:rPr>
+                <w:rFonts w:ascii="Calibri" w:hAnsi="Calibri" w:cs="Calibri"/>
+                <w:b/>
+                <w:sz w:val="22"/>
+                <w:szCs w:val="22"/>
+              </w:rPr>
+              <w:t>}</w:t>
             </w:r>
           </w:p>
         </w:tc>
@@ -1918,7 +2222,27 @@
                 <w:sz w:val="22"/>
                 <w:szCs w:val="22"/>
               </w:rPr>
-              <w:t>{llamadoResultado}</w:t>
+              <w:t>{</w:t>
+            </w:r>
+            <w:proofErr w:type="spellStart"/>
+            <w:r>
+              <w:rPr>
+                <w:rFonts w:ascii="Calibri" w:hAnsi="Calibri" w:cs="Calibri"/>
+                <w:b/>
+                <w:sz w:val="22"/>
+                <w:szCs w:val="22"/>
+              </w:rPr>
+              <w:t>llamadoResultado</w:t>
+            </w:r>
+            <w:proofErr w:type="spellEnd"/>
+            <w:r>
+              <w:rPr>
+                <w:rFonts w:ascii="Calibri" w:hAnsi="Calibri" w:cs="Calibri"/>
+                <w:b/>
+                <w:sz w:val="22"/>
+                <w:szCs w:val="22"/>
+              </w:rPr>
+              <w:t>}</w:t>
             </w:r>
           </w:p>
         </w:tc>
@@ -1985,7 +2309,27 @@
                 <w:sz w:val="22"/>
                 <w:szCs w:val="22"/>
               </w:rPr>
-              <w:t>{visitaCantidad}</w:t>
+              <w:t>{</w:t>
+            </w:r>
+            <w:proofErr w:type="spellStart"/>
+            <w:r>
+              <w:rPr>
+                <w:rFonts w:ascii="Calibri" w:hAnsi="Calibri" w:cs="Calibri"/>
+                <w:b/>
+                <w:sz w:val="22"/>
+                <w:szCs w:val="22"/>
+              </w:rPr>
+              <w:t>visitaCantidad</w:t>
+            </w:r>
+            <w:proofErr w:type="spellEnd"/>
+            <w:r>
+              <w:rPr>
+                <w:rFonts w:ascii="Calibri" w:hAnsi="Calibri" w:cs="Calibri"/>
+                <w:b/>
+                <w:sz w:val="22"/>
+                <w:szCs w:val="22"/>
+              </w:rPr>
+              <w:t>}</w:t>
             </w:r>
           </w:p>
         </w:tc>
@@ -2019,7 +2363,27 @@
                 <w:sz w:val="22"/>
                 <w:szCs w:val="22"/>
               </w:rPr>
-              <w:t>{visitaCantidad}</w:t>
+              <w:t>{</w:t>
+            </w:r>
+            <w:proofErr w:type="spellStart"/>
+            <w:r>
+              <w:rPr>
+                <w:rFonts w:ascii="Calibri" w:hAnsi="Calibri" w:cs="Calibri"/>
+                <w:b/>
+                <w:sz w:val="22"/>
+                <w:szCs w:val="22"/>
+              </w:rPr>
+              <w:t>visitaCantidad</w:t>
+            </w:r>
+            <w:proofErr w:type="spellEnd"/>
+            <w:r>
+              <w:rPr>
+                <w:rFonts w:ascii="Calibri" w:hAnsi="Calibri" w:cs="Calibri"/>
+                <w:b/>
+                <w:sz w:val="22"/>
+                <w:szCs w:val="22"/>
+              </w:rPr>
+              <w:t>}</w:t>
             </w:r>
           </w:p>
         </w:tc>
@@ -2053,7 +2417,27 @@
                 <w:sz w:val="22"/>
                 <w:szCs w:val="22"/>
               </w:rPr>
-              <w:t>{visitaFecha}</w:t>
+              <w:t>{</w:t>
+            </w:r>
+            <w:proofErr w:type="spellStart"/>
+            <w:r>
+              <w:rPr>
+                <w:rFonts w:ascii="Calibri" w:hAnsi="Calibri" w:cs="Calibri"/>
+                <w:b/>
+                <w:sz w:val="22"/>
+                <w:szCs w:val="22"/>
+              </w:rPr>
+              <w:t>visitaFecha</w:t>
+            </w:r>
+            <w:proofErr w:type="spellEnd"/>
+            <w:r>
+              <w:rPr>
+                <w:rFonts w:ascii="Calibri" w:hAnsi="Calibri" w:cs="Calibri"/>
+                <w:b/>
+                <w:sz w:val="22"/>
+                <w:szCs w:val="22"/>
+              </w:rPr>
+              <w:t>}</w:t>
             </w:r>
           </w:p>
         </w:tc>
@@ -2101,7 +2485,27 @@
                 <w:sz w:val="22"/>
                 <w:szCs w:val="22"/>
               </w:rPr>
-              <w:t>{visitaResultado}</w:t>
+              <w:t>{</w:t>
+            </w:r>
+            <w:proofErr w:type="spellStart"/>
+            <w:r>
+              <w:rPr>
+                <w:rFonts w:ascii="Calibri" w:hAnsi="Calibri" w:cs="Calibri"/>
+                <w:b/>
+                <w:sz w:val="22"/>
+                <w:szCs w:val="22"/>
+              </w:rPr>
+              <w:t>visitaResultado</w:t>
+            </w:r>
+            <w:proofErr w:type="spellEnd"/>
+            <w:r>
+              <w:rPr>
+                <w:rFonts w:ascii="Calibri" w:hAnsi="Calibri" w:cs="Calibri"/>
+                <w:b/>
+                <w:sz w:val="22"/>
+                <w:szCs w:val="22"/>
+              </w:rPr>
+              <w:t>}</w:t>
             </w:r>
           </w:p>
         </w:tc>
@@ -2168,7 +2572,27 @@
                 <w:sz w:val="22"/>
                 <w:szCs w:val="22"/>
               </w:rPr>
-              <w:t>{teamsCantidad}</w:t>
+              <w:t>{</w:t>
+            </w:r>
+            <w:proofErr w:type="spellStart"/>
+            <w:r>
+              <w:rPr>
+                <w:rFonts w:ascii="Calibri" w:hAnsi="Calibri" w:cs="Calibri"/>
+                <w:b/>
+                <w:sz w:val="22"/>
+                <w:szCs w:val="22"/>
+              </w:rPr>
+              <w:t>teamsCantidad</w:t>
+            </w:r>
+            <w:proofErr w:type="spellEnd"/>
+            <w:r>
+              <w:rPr>
+                <w:rFonts w:ascii="Calibri" w:hAnsi="Calibri" w:cs="Calibri"/>
+                <w:b/>
+                <w:sz w:val="22"/>
+                <w:szCs w:val="22"/>
+              </w:rPr>
+              <w:t>}</w:t>
             </w:r>
           </w:p>
         </w:tc>
@@ -2202,7 +2626,27 @@
                 <w:sz w:val="22"/>
                 <w:szCs w:val="22"/>
               </w:rPr>
-              <w:t>{teamsCantidad}</w:t>
+              <w:t>{</w:t>
+            </w:r>
+            <w:proofErr w:type="spellStart"/>
+            <w:r>
+              <w:rPr>
+                <w:rFonts w:ascii="Calibri" w:hAnsi="Calibri" w:cs="Calibri"/>
+                <w:b/>
+                <w:sz w:val="22"/>
+                <w:szCs w:val="22"/>
+              </w:rPr>
+              <w:t>teamsCantidad</w:t>
+            </w:r>
+            <w:proofErr w:type="spellEnd"/>
+            <w:r>
+              <w:rPr>
+                <w:rFonts w:ascii="Calibri" w:hAnsi="Calibri" w:cs="Calibri"/>
+                <w:b/>
+                <w:sz w:val="22"/>
+                <w:szCs w:val="22"/>
+              </w:rPr>
+              <w:t>}</w:t>
             </w:r>
           </w:p>
         </w:tc>
@@ -2236,7 +2680,27 @@
                 <w:sz w:val="22"/>
                 <w:szCs w:val="22"/>
               </w:rPr>
-              <w:t>{teamsFecha}</w:t>
+              <w:t>{</w:t>
+            </w:r>
+            <w:proofErr w:type="spellStart"/>
+            <w:r>
+              <w:rPr>
+                <w:rFonts w:ascii="Calibri" w:hAnsi="Calibri" w:cs="Calibri"/>
+                <w:b/>
+                <w:sz w:val="22"/>
+                <w:szCs w:val="22"/>
+              </w:rPr>
+              <w:t>teamsFecha</w:t>
+            </w:r>
+            <w:proofErr w:type="spellEnd"/>
+            <w:r>
+              <w:rPr>
+                <w:rFonts w:ascii="Calibri" w:hAnsi="Calibri" w:cs="Calibri"/>
+                <w:b/>
+                <w:sz w:val="22"/>
+                <w:szCs w:val="22"/>
+              </w:rPr>
+              <w:t>}</w:t>
             </w:r>
           </w:p>
         </w:tc>
@@ -2284,7 +2748,27 @@
                 <w:sz w:val="22"/>
                 <w:szCs w:val="22"/>
               </w:rPr>
-              <w:t>{teamsResultado}</w:t>
+              <w:t>{</w:t>
+            </w:r>
+            <w:proofErr w:type="spellStart"/>
+            <w:r>
+              <w:rPr>
+                <w:rFonts w:ascii="Calibri" w:hAnsi="Calibri" w:cs="Calibri"/>
+                <w:b/>
+                <w:sz w:val="22"/>
+                <w:szCs w:val="22"/>
+              </w:rPr>
+              <w:t>teamsResultado</w:t>
+            </w:r>
+            <w:proofErr w:type="spellEnd"/>
+            <w:r>
+              <w:rPr>
+                <w:rFonts w:ascii="Calibri" w:hAnsi="Calibri" w:cs="Calibri"/>
+                <w:b/>
+                <w:sz w:val="22"/>
+                <w:szCs w:val="22"/>
+              </w:rPr>
+              <w:t>}</w:t>
             </w:r>
           </w:p>
         </w:tc>
@@ -2423,7 +2907,27 @@
                 <w:sz w:val="22"/>
                 <w:szCs w:val="22"/>
               </w:rPr>
-              <w:t>{lugarDerivacion}</w:t>
+              <w:t>{</w:t>
+            </w:r>
+            <w:proofErr w:type="spellStart"/>
+            <w:r>
+              <w:rPr>
+                <w:rFonts w:ascii="Calibri" w:hAnsi="Calibri" w:cs="Calibri"/>
+                <w:b/>
+                <w:sz w:val="22"/>
+                <w:szCs w:val="22"/>
+              </w:rPr>
+              <w:t>lugarDerivacion</w:t>
+            </w:r>
+            <w:proofErr w:type="spellEnd"/>
+            <w:r>
+              <w:rPr>
+                <w:rFonts w:ascii="Calibri" w:hAnsi="Calibri" w:cs="Calibri"/>
+                <w:b/>
+                <w:sz w:val="22"/>
+                <w:szCs w:val="22"/>
+              </w:rPr>
+              <w:t>}</w:t>
             </w:r>
           </w:p>
         </w:tc>
@@ -2491,7 +2995,27 @@
                 <w:sz w:val="22"/>
                 <w:szCs w:val="22"/>
               </w:rPr>
-              <w:t>{motivoCierre}</w:t>
+              <w:t>{</w:t>
+            </w:r>
+            <w:proofErr w:type="spellStart"/>
+            <w:r>
+              <w:rPr>
+                <w:rFonts w:ascii="Calibri" w:hAnsi="Calibri" w:cs="Calibri"/>
+                <w:b/>
+                <w:sz w:val="22"/>
+                <w:szCs w:val="22"/>
+              </w:rPr>
+              <w:t>motivoCierre</w:t>
+            </w:r>
+            <w:proofErr w:type="spellEnd"/>
+            <w:r>
+              <w:rPr>
+                <w:rFonts w:ascii="Calibri" w:hAnsi="Calibri" w:cs="Calibri"/>
+                <w:b/>
+                <w:sz w:val="22"/>
+                <w:szCs w:val="22"/>
+              </w:rPr>
+              <w:t>}</w:t>
             </w:r>
           </w:p>
         </w:tc>
@@ -2558,7 +3082,27 @@
                 <w:sz w:val="22"/>
                 <w:szCs w:val="22"/>
               </w:rPr>
-              <w:t>{profesionalDeriva}</w:t>
+              <w:t>{</w:t>
+            </w:r>
+            <w:proofErr w:type="spellStart"/>
+            <w:r>
+              <w:rPr>
+                <w:rFonts w:ascii="Calibri" w:hAnsi="Calibri" w:cs="Calibri"/>
+                <w:b/>
+                <w:sz w:val="22"/>
+                <w:szCs w:val="22"/>
+              </w:rPr>
+              <w:t>profesionalDeriva</w:t>
+            </w:r>
+            <w:proofErr w:type="spellEnd"/>
+            <w:r>
+              <w:rPr>
+                <w:rFonts w:ascii="Calibri" w:hAnsi="Calibri" w:cs="Calibri"/>
+                <w:b/>
+                <w:sz w:val="22"/>
+                <w:szCs w:val="22"/>
+              </w:rPr>
+              <w:t>}</w:t>
             </w:r>
           </w:p>
         </w:tc>
@@ -2620,7 +3164,27 @@
                 <w:sz w:val="22"/>
                 <w:szCs w:val="22"/>
               </w:rPr>
-              <w:t>{fechaCierre}</w:t>
+              <w:t>{</w:t>
+            </w:r>
+            <w:proofErr w:type="spellStart"/>
+            <w:r>
+              <w:rPr>
+                <w:rFonts w:ascii="Calibri" w:hAnsi="Calibri" w:cs="Calibri"/>
+                <w:b/>
+                <w:sz w:val="22"/>
+                <w:szCs w:val="22"/>
+              </w:rPr>
+              <w:t>fechaCierre</w:t>
+            </w:r>
+            <w:proofErr w:type="spellEnd"/>
+            <w:r>
+              <w:rPr>
+                <w:rFonts w:ascii="Calibri" w:hAnsi="Calibri" w:cs="Calibri"/>
+                <w:b/>
+                <w:sz w:val="22"/>
+                <w:szCs w:val="22"/>
+              </w:rPr>
+              <w:t>}</w:t>
             </w:r>
           </w:p>
         </w:tc>
@@ -2756,7 +3320,27 @@
                 <w:sz w:val="22"/>
                 <w:szCs w:val="22"/>
               </w:rPr>
-              <w:t>{profesionalNombre}</w:t>
+              <w:t>{</w:t>
+            </w:r>
+            <w:proofErr w:type="spellStart"/>
+            <w:r>
+              <w:rPr>
+                <w:rFonts w:ascii="Calibri" w:hAnsi="Calibri" w:cs="Calibri"/>
+                <w:b/>
+                <w:sz w:val="22"/>
+                <w:szCs w:val="22"/>
+              </w:rPr>
+              <w:t>profesionalNombre</w:t>
+            </w:r>
+            <w:proofErr w:type="spellEnd"/>
+            <w:r>
+              <w:rPr>
+                <w:rFonts w:ascii="Calibri" w:hAnsi="Calibri" w:cs="Calibri"/>
+                <w:b/>
+                <w:sz w:val="22"/>
+                <w:szCs w:val="22"/>
+              </w:rPr>
+              <w:t>}</w:t>
             </w:r>
           </w:p>
         </w:tc>
@@ -2818,7 +3402,27 @@
                 <w:sz w:val="22"/>
                 <w:szCs w:val="22"/>
               </w:rPr>
-              <w:t>{profesionalCargo}</w:t>
+              <w:t>{</w:t>
+            </w:r>
+            <w:proofErr w:type="spellStart"/>
+            <w:r>
+              <w:rPr>
+                <w:rFonts w:ascii="Calibri" w:hAnsi="Calibri" w:cs="Calibri"/>
+                <w:b/>
+                <w:sz w:val="22"/>
+                <w:szCs w:val="22"/>
+              </w:rPr>
+              <w:t>profesionalCargo</w:t>
+            </w:r>
+            <w:proofErr w:type="spellEnd"/>
+            <w:r>
+              <w:rPr>
+                <w:rFonts w:ascii="Calibri" w:hAnsi="Calibri" w:cs="Calibri"/>
+                <w:b/>
+                <w:sz w:val="22"/>
+                <w:szCs w:val="22"/>
+              </w:rPr>
+              <w:t>}</w:t>
             </w:r>
           </w:p>
         </w:tc>
@@ -3116,7 +3720,29 @@
           <w:sz w:val="22"/>
           <w:szCs w:val="22"/>
         </w:rPr>
-        <w:t>Egreso CSJ¨ para efectos de la causal de termino del proceso.</w:t>
+        <w:t xml:space="preserve">Egreso CSJ¨ para efectos de la causal de </w:t>
+      </w:r>
+      <w:proofErr w:type="spellStart"/>
+      <w:r>
+        <w:rPr>
+          <w:rFonts w:ascii="Calibri" w:hAnsi="Calibri" w:cs="Calibri"/>
+          <w:bCs/>
+          <w:iCs/>
+          <w:sz w:val="22"/>
+          <w:szCs w:val="22"/>
+        </w:rPr>
+        <w:t>termino</w:t>
+      </w:r>
+      <w:proofErr w:type="spellEnd"/>
+      <w:r>
+        <w:rPr>
+          <w:rFonts w:ascii="Calibri" w:hAnsi="Calibri" w:cs="Calibri"/>
+          <w:bCs/>
+          <w:iCs/>
+          <w:sz w:val="22"/>
+          <w:szCs w:val="22"/>
+        </w:rPr>
+        <w:t xml:space="preserve"> del proceso.</w:t>
       </w:r>
     </w:p>
     <w:p>
@@ -3900,14 +4526,25 @@
         </w:rPr>
         <w:t xml:space="preserve"> </w:t>
       </w:r>
-      <w:r>
-        <w:rPr>
-          <w:rFonts w:ascii="Calibri" w:hAnsi="Calibri" w:cs="Calibri"/>
-          <w:b/>
-          <w:sz w:val="16"/>
-          <w:szCs w:val="16"/>
-        </w:rPr>
-        <w:t xml:space="preserve">Nº de Celular: </w:t>
+      <w:proofErr w:type="spellStart"/>
+      <w:r>
+        <w:rPr>
+          <w:rFonts w:ascii="Calibri" w:hAnsi="Calibri" w:cs="Calibri"/>
+          <w:b/>
+          <w:sz w:val="16"/>
+          <w:szCs w:val="16"/>
+        </w:rPr>
+        <w:t>Nº</w:t>
+      </w:r>
+      <w:proofErr w:type="spellEnd"/>
+      <w:r>
+        <w:rPr>
+          <w:rFonts w:ascii="Calibri" w:hAnsi="Calibri" w:cs="Calibri"/>
+          <w:b/>
+          <w:sz w:val="16"/>
+          <w:szCs w:val="16"/>
+        </w:rPr>
+        <w:t xml:space="preserve"> de Celular: </w:t>
       </w:r>
       <w:r>
         <w:rPr>
@@ -4511,7 +5148,25 @@
           <w:sz w:val="16"/>
           <w:szCs w:val="16"/>
         </w:rPr>
-        <w:t xml:space="preserve"> la atención, a que se compromete el usuario, Ej. Dejar el Curriculum en DIDECO.</w:t>
+        <w:t xml:space="preserve"> la atención, a que se compromete el usuario, Ej. Dejar el </w:t>
+      </w:r>
+      <w:proofErr w:type="spellStart"/>
+      <w:r>
+        <w:rPr>
+          <w:rFonts w:ascii="Calibri" w:hAnsi="Calibri" w:cs="Calibri"/>
+          <w:sz w:val="16"/>
+          <w:szCs w:val="16"/>
+        </w:rPr>
+        <w:t>Curriculum</w:t>
+      </w:r>
+      <w:proofErr w:type="spellEnd"/>
+      <w:r>
+        <w:rPr>
+          <w:rFonts w:ascii="Calibri" w:hAnsi="Calibri" w:cs="Calibri"/>
+          <w:sz w:val="16"/>
+          <w:szCs w:val="16"/>
+        </w:rPr>
+        <w:t xml:space="preserve"> en DIDECO.</w:t>
       </w:r>
     </w:p>
   </w:footnote>
@@ -5565,6 +6220,50 @@
     <w:lsdException w:name="Subtitle" w:qFormat="1"/>
     <w:lsdException w:name="Strong" w:qFormat="1"/>
     <w:lsdException w:name="Emphasis" w:qFormat="1"/>
+    <w:lsdException w:name="Normal Table" w:semiHidden="1" w:unhideWhenUsed="1"/>
+    <w:lsdException w:name="Table Simple 1" w:semiHidden="1" w:unhideWhenUsed="1"/>
+    <w:lsdException w:name="Table Simple 2" w:semiHidden="1" w:unhideWhenUsed="1"/>
+    <w:lsdException w:name="Table Simple 3" w:semiHidden="1" w:unhideWhenUsed="1"/>
+    <w:lsdException w:name="Table Classic 1" w:semiHidden="1" w:unhideWhenUsed="1"/>
+    <w:lsdException w:name="Table Classic 2" w:semiHidden="1" w:unhideWhenUsed="1"/>
+    <w:lsdException w:name="Table Classic 3" w:semiHidden="1" w:unhideWhenUsed="1"/>
+    <w:lsdException w:name="Table Classic 4" w:semiHidden="1" w:unhideWhenUsed="1"/>
+    <w:lsdException w:name="Table Colorful 1" w:semiHidden="1" w:unhideWhenUsed="1"/>
+    <w:lsdException w:name="Table Colorful 2" w:semiHidden="1" w:unhideWhenUsed="1"/>
+    <w:lsdException w:name="Table Colorful 3" w:semiHidden="1" w:unhideWhenUsed="1"/>
+    <w:lsdException w:name="Table Columns 1" w:semiHidden="1" w:unhideWhenUsed="1"/>
+    <w:lsdException w:name="Table Columns 2" w:semiHidden="1" w:unhideWhenUsed="1"/>
+    <w:lsdException w:name="Table Columns 3" w:semiHidden="1" w:unhideWhenUsed="1"/>
+    <w:lsdException w:name="Table Columns 4" w:semiHidden="1" w:unhideWhenUsed="1"/>
+    <w:lsdException w:name="Table Columns 5" w:semiHidden="1" w:unhideWhenUsed="1"/>
+    <w:lsdException w:name="Table Grid 1" w:semiHidden="1" w:unhideWhenUsed="1"/>
+    <w:lsdException w:name="Table Grid 2" w:semiHidden="1" w:unhideWhenUsed="1"/>
+    <w:lsdException w:name="Table Grid 3" w:semiHidden="1" w:unhideWhenUsed="1"/>
+    <w:lsdException w:name="Table Grid 4" w:semiHidden="1" w:unhideWhenUsed="1"/>
+    <w:lsdException w:name="Table Grid 5" w:semiHidden="1" w:unhideWhenUsed="1"/>
+    <w:lsdException w:name="Table Grid 6" w:semiHidden="1" w:unhideWhenUsed="1"/>
+    <w:lsdException w:name="Table Grid 7" w:semiHidden="1" w:unhideWhenUsed="1"/>
+    <w:lsdException w:name="Table Grid 8" w:semiHidden="1" w:unhideWhenUsed="1"/>
+    <w:lsdException w:name="Table List 1" w:semiHidden="1" w:unhideWhenUsed="1"/>
+    <w:lsdException w:name="Table List 2" w:semiHidden="1" w:unhideWhenUsed="1"/>
+    <w:lsdException w:name="Table List 3" w:semiHidden="1" w:unhideWhenUsed="1"/>
+    <w:lsdException w:name="Table List 4" w:semiHidden="1" w:unhideWhenUsed="1"/>
+    <w:lsdException w:name="Table List 5" w:semiHidden="1" w:unhideWhenUsed="1"/>
+    <w:lsdException w:name="Table List 6" w:semiHidden="1" w:unhideWhenUsed="1"/>
+    <w:lsdException w:name="Table List 7" w:semiHidden="1" w:unhideWhenUsed="1"/>
+    <w:lsdException w:name="Table List 8" w:semiHidden="1" w:unhideWhenUsed="1"/>
+    <w:lsdException w:name="Table 3D effects 1" w:semiHidden="1" w:unhideWhenUsed="1"/>
+    <w:lsdException w:name="Table 3D effects 2" w:semiHidden="1" w:unhideWhenUsed="1"/>
+    <w:lsdException w:name="Table 3D effects 3" w:semiHidden="1" w:unhideWhenUsed="1"/>
+    <w:lsdException w:name="Table Contemporary" w:semiHidden="1" w:unhideWhenUsed="1"/>
+    <w:lsdException w:name="Table Elegant" w:semiHidden="1" w:unhideWhenUsed="1"/>
+    <w:lsdException w:name="Table Professional" w:semiHidden="1" w:unhideWhenUsed="1"/>
+    <w:lsdException w:name="Table Subtle 1" w:semiHidden="1" w:unhideWhenUsed="1"/>
+    <w:lsdException w:name="Table Subtle 2" w:semiHidden="1" w:unhideWhenUsed="1"/>
+    <w:lsdException w:name="Table Web 1" w:semiHidden="1" w:unhideWhenUsed="1"/>
+    <w:lsdException w:name="Table Web 2" w:semiHidden="1" w:unhideWhenUsed="1"/>
+    <w:lsdException w:name="Table Web 3" w:semiHidden="1" w:unhideWhenUsed="1"/>
+    <w:lsdException w:name="Table Theme" w:semiHidden="1" w:unhideWhenUsed="1"/>
     <w:lsdException w:name="Placeholder Text" w:semiHidden="1" w:uiPriority="99"/>
     <w:lsdException w:name="No Spacing" w:uiPriority="1" w:qFormat="1"/>
     <w:lsdException w:name="Light Shading" w:uiPriority="60"/>
@@ -5842,7 +6541,6 @@
     <w:uiPriority w:val="99"/>
     <w:semiHidden/>
     <w:unhideWhenUsed/>
-    <w:qFormat/>
     <w:tblPr>
       <w:tblInd w:w="0" w:type="dxa"/>
       <w:tblCellMar>

</xml_diff>